<commit_message>
Retain GrandQC candidates through KODAMA
</commit_message>
<xml_diff>
--- a/deliverables/CellPhenotyper_Nature_Methods_20260922.docx
+++ b/deliverables/CellPhenotyper_Nature_Methods_20260922.docx
@@ -2272,12 +2272,7 @@
     <w:p>
       <w:pPr/>
       <w:r>
-        <w:rPr>
-          <w:rFonts w:ascii="Calibri" w:hAnsi="Calibri" w:eastAsia="Calibri"/>
-          <w:color w:val="1F2937"/>
-          <w:sz w:val="22"/>
-        </w:rPr>
-        <w:t>The input was converted to pyramidal OME-TIFF [18] while retaining level-0 dimensions and MPP. The initial image measured 16,016 × 14,625 pixels at 0.547304 µm per pixel. Downstream cell analysis used an automatically prepared crop of 11,912 × 13,303 pixels at 0.547302 µm per pixel, with shift metadata linking crop and source coordinates. All MPP-sensitive stages resolved physical scale from OME metadata or the saved coordinate transform; configured fallbacks were used only when metadata could not be recovered.</w:t>
+        <w:t>The input was converted to pyramidal OME-TIFF [18] while retaining level-0 dimensions and MPP. The initial image measured 16,016 × 14,625 pixels at 0.547304 µm per pixel. Downstream cell analysis used an automatically prepared crop of 11,912 × 13,303 pixels at 0.547302 µm per pixel, with shift metadata linking crop and source coordinates. The crop was written as a tiled RGB OME-TIFF with SubIFD overviews down to one tile, using the configured input codec; dimensions, physical resolution, compression and pyramid geometry were validated before publication. All MPP-sensitive stages resolved physical scale from OME metadata or the saved coordinate transform; configured fallbacks were used only when metadata could not be recovered.</w:t>
       </w:r>
     </w:p>
     <w:p>
@@ -2295,12 +2290,7 @@
     <w:p>
       <w:pPr/>
       <w:r>
-        <w:rPr>
-          <w:rFonts w:ascii="Calibri" w:hAnsi="Calibri" w:eastAsia="Calibri"/>
-          <w:color w:val="1F2937"/>
-          <w:sz w:val="22"/>
-        </w:rPr>
-        <w:t>Official GrandQC tissue and artifact checkpoints were used [5]. The tissue detector used its 10-µm-per-pixel model. Hardware-aware selection chose the 2.0-µm-per-pixel artifact model and 1,024-pixel context tiles on CUDA. Tiles overlapped by 512 pixels, and class probabilities were combined with a smooth blending window before argmax classification. Outputs included tissue, clean-tissue and multiclass artifact masks; class-coloured previews; GeoJSON; and a JSON summary containing model paths, scale factors, class counts and fractions. GrandQC source code was not retrained; CellPhenotyper added OME-TIFF access, physical-scale model selection, adaptive context, overlap blending, fallbacks for pathological tissue-detector failures and standardized outputs.</w:t>
+        <w:t>Official GrandQC tissue and artifact checkpoints were used [5]. The tissue detector used its 10-µm-per-pixel model. Hardware-aware selection chose the 2.0-µm-per-pixel artifact model and 1,024-pixel context tiles on CUDA. Tiles overlapped by 512 pixels, and class probabilities were combined with a smooth blending window before argmax classification. The default analysis-support mask retained all tissue-detector-positive pixels, including artifact candidates, while background was excluded. The cropped artifact mask was propagated separately, and each UNI-2 grid observation recorded its candidate overlap. Candidate observations entered UNI-2 and KODAMA unchanged. After clustering, a candidate was excluded only when its mean 15-nearest-neighbour distance to non-candidate observations in the same cluster exceeded both the 99.5th percentile and median plus six median absolute deviations of the reference-distance distribution. Clusters with fewer than 50 non-candidate references failed open. Outputs retained candidate flags, distances, thresholds, scores, tissue and artifact masks, previews, GeoJSON and model provenance. This gate is an unsupervised engineering policy and not a validated artifact classifier.</w:t>
       </w:r>
     </w:p>
     <w:p>
@@ -2479,7 +2469,7 @@
     <w:p>
       <w:pPr/>
       <w:r>
-        <w:t>Clustering used only the two-dimensional KODAMA visualization [13]. For every cell, Rnanoflann computed the mean distance to 50 nearest neighbours. Ten thousand landmarks were sampled without replacement with probability proportional to the inverse square of that distance, and a 30-neighbour shared-nearest-neighbour graph was constructed on the landmarks. When cluster_resolution was auto, candidate Leiden resolutions 0.005, 0.010, 0.020, 0.030, 0.040 and 0.050 were evaluated across the configured random seeds on a common landmark graph and all-cell nearest-neighbour query. For each candidate, a predicted abstention was the union of a landmark-vote margin below the declared assignment threshold and an across-seed agreement fraction below the declared stability threshold. Candidates with fewer than two clusters or more than the adaptive cluster-count cap were excluded. The eligible candidate with the fewest predicted abstentions determined both the resolution and cluster number; ties were resolved by mean and minimum adjusted Rand index, tiny-cluster burden, silhouette, modularity and then the smaller cluster count. The selected resolution was held fixed during a broader stability pass that resampled landmarks. Candidate metrics and the selected row were written to the cluster-resolution candidate table. The former silhouette, modularity and complexity selector remained available as an explicit compatibility option. Clusters smaller than 1% of cells could subsequently be merged.</w:t>
+        <w:t>Clustering used only the two-dimensional KODAMA visualization [13]. For every cell, Rnanoflann computed the mean distance to 50 nearest neighbours. Ten thousand landmarks were sampled without replacement with probability proportional to the inverse square of that distance, and a 30-neighbour shared-nearest-neighbour graph was constructed on the landmarks. When cluster_resolution was auto, candidate Leiden resolutions 0.005, 0.010, 0.020, 0.030, 0.040 and 0.050 were evaluated across the configured random seeds on a common landmark graph and all-cell nearest-neighbour query. For each candidate, a predicted abstention was the union of a landmark-vote margin below the declared assignment threshold and an across-seed agreement fraction below the declared stability threshold. Candidates with fewer than two clusters or more than the adaptive cluster-count cap were excluded. The eligible candidate with the fewest predicted abstentions determined both the resolution and cluster number; ties were resolved by mean and minimum adjusted Rand index, tiny-cluster burden, silhouette, modularity and then the smaller cluster count. The selected resolution was held fixed during a broader stability pass that resampled landmarks. Candidate metrics and the selected row were written to the cluster-resolution candidate table. The former silhouette, modularity and complexity selector remained available as an explicit compatibility option. Clusters smaller than 1% of cells could subsequently be merged. GrandQC artifact candidates were not removed before graph construction. The selected partition was used only afterward to evaluate candidate-specific KODAMA-display outliers within each cluster; confirmed outliers were explicitly marked for downstream exclusion, whereas all other candidates retained their raw cluster assignment.</w:t>
       </w:r>
     </w:p>
     <w:p>
@@ -2497,12 +2487,7 @@
     <w:p>
       <w:pPr/>
       <w:r>
-        <w:rPr>
-          <w:rFonts w:ascii="Calibri" w:hAnsi="Calibri" w:eastAsia="Calibri"/>
-          <w:color w:val="1F2937"/>
-          <w:sz w:val="22"/>
-        </w:rPr>
-        <w:t>Cluster labels were joined to canonical cell identifiers and projected through the cell-associated mask. Seed labels were expanded only inside the tissue mask by nearest-label growth and morphological regularization. MedSAM [14] was used as a refinement model, not as a first-pass cluster detector. It received the H&amp;E crop, protected cluster seeds and grown mask, and was allowed to alter only a configurable border band. The representative run used CUDA, 4,096-pixel tiles, 512-pixel overlap and 16 tiles. Labels were processed independently, including tiles containing one cluster, followed by deterministic overlap resolution and conservative cleanup. Outputs included refined and intermediate masks, whole-slide previews, change maps, raw-versus-final panels and one random 1,024 × 1,024 full-resolution quality-control region.</w:t>
+        <w:t>Cluster labels were joined to canonical cell identifiers and projected through the cell-associated mask. Seed labels were expanded only inside the tissue mask by nearest-label growth and morphological regularization. MedSAM [14] was used as a refinement model, not as a first-pass cluster detector. It received the H&amp;E crop, protected cluster seeds and grown mask, and was allowed to alter only a configurable border band. GrandQC artifact candidates remained in the baseline unless the post-KODAMA gate confirmed them as outliers; confirmed cores were encoded as uncertainty code 5 and treated as hard exclusions throughout MedSAM. The representative run used CUDA, 4,096-pixel tiles, 512-pixel overlap and 16 tiles. Labels were processed independently, including tiles containing one cluster, followed by deterministic overlap resolution and conservative cleanup. Outputs included refined and intermediate masks, whole-slide previews, change maps, raw-versus-final panels and one random 1,024 × 1,024 full-resolution quality-control region.</w:t>
       </w:r>
     </w:p>
     <w:p>

</xml_diff>